<commit_message>
docs: add nowcasting engine flowchart and Metabase monitoring dashboards to progress report
</commit_message>
<xml_diff>
--- a/Nowcasting_Inflation_via_Daily_Web_Scraping_Price.docx
+++ b/Nowcasting_Inflation_via_Daily_Web_Scraping_Price.docx
@@ -1909,6 +1909,61 @@
     </w:p>
     <w:p>
       <w:pPr>
+        <w:spacing w:before="120" w:after="40"/>
+        <w:jc w:val="center"/>
+      </w:pPr>
+      <w:r>
+        <w:drawing>
+          <wp:inline xmlns:a="http://schemas.openxmlformats.org/drawingml/2006/main" xmlns:pic="http://schemas.openxmlformats.org/drawingml/2006/picture">
+            <wp:extent cx="5303520" cy="3748145"/>
+            <wp:docPr id="2" name="Picture 2"/>
+            <wp:cNvGraphicFramePr>
+              <a:graphicFrameLocks noChangeAspect="1"/>
+            </wp:cNvGraphicFramePr>
+            <a:graphic>
+              <a:graphicData uri="http://schemas.openxmlformats.org/drawingml/2006/picture">
+                <pic:pic>
+                  <pic:nvPicPr>
+                    <pic:cNvPr id="0" name="nowcasting_flowchart.png"/>
+                    <pic:cNvPicPr/>
+                  </pic:nvPicPr>
+                  <pic:blipFill>
+                    <a:blip r:embed="rId12"/>
+                    <a:stretch>
+                      <a:fillRect/>
+                    </a:stretch>
+                  </pic:blipFill>
+                  <pic:spPr>
+                    <a:xfrm>
+                      <a:off x="0" y="0"/>
+                      <a:ext cx="5303520" cy="3748145"/>
+                    </a:xfrm>
+                    <a:prstGeom prst="rect"/>
+                  </pic:spPr>
+                </pic:pic>
+              </a:graphicData>
+            </a:graphic>
+          </wp:inline>
+        </w:drawing>
+      </w:r>
+    </w:p>
+    <w:p>
+      <w:pPr>
+        <w:spacing w:before="20" w:after="120"/>
+        <w:jc w:val="center"/>
+      </w:pPr>
+      <w:r>
+        <w:rPr>
+          <w:rFonts w:ascii="Calibri" w:hAnsi="Calibri"/>
+          <w:i/>
+          <w:color w:val="646464"/>
+          <w:sz w:val="17"/>
+        </w:rPr>
+        <w:t>Figure 2: Architecture Flowchart of the Two-Tier Inflation Nowcasting Engine</w:t>
+      </w:r>
+    </w:p>
+    <w:p>
+      <w:pPr>
         <w:spacing w:before="80" w:after="40"/>
       </w:pPr>
       <w:r>
@@ -1976,6 +2031,288 @@
       </w:r>
       <w:r>
         <w:t>Ingests daily USD/KHR commercial exchange rates.</w:t>
+      </w:r>
+    </w:p>
+    <w:p>
+      <w:pPr>
+        <w:spacing w:before="120" w:after="40"/>
+        <w:jc w:val="center"/>
+      </w:pPr>
+      <w:r>
+        <w:drawing>
+          <wp:inline xmlns:a="http://schemas.openxmlformats.org/drawingml/2006/main" xmlns:pic="http://schemas.openxmlformats.org/drawingml/2006/picture">
+            <wp:extent cx="5120640" cy="2680450"/>
+            <wp:docPr id="3" name="Picture 3"/>
+            <wp:cNvGraphicFramePr>
+              <a:graphicFrameLocks noChangeAspect="1"/>
+            </wp:cNvGraphicFramePr>
+            <a:graphic>
+              <a:graphicData uri="http://schemas.openxmlformats.org/drawingml/2006/picture">
+                <pic:pic>
+                  <pic:nvPicPr>
+                    <pic:cNvPr id="0" name="cpi_nowcasting_convergence.png"/>
+                    <pic:cNvPicPr/>
+                  </pic:nvPicPr>
+                  <pic:blipFill>
+                    <a:blip r:embed="rId13"/>
+                    <a:stretch>
+                      <a:fillRect/>
+                    </a:stretch>
+                  </pic:blipFill>
+                  <pic:spPr>
+                    <a:xfrm>
+                      <a:off x="0" y="0"/>
+                      <a:ext cx="5120640" cy="2680450"/>
+                    </a:xfrm>
+                    <a:prstGeom prst="rect"/>
+                  </pic:spPr>
+                </pic:pic>
+              </a:graphicData>
+            </a:graphic>
+          </wp:inline>
+        </w:drawing>
+      </w:r>
+    </w:p>
+    <w:p>
+      <w:pPr>
+        <w:spacing w:before="20" w:after="120"/>
+        <w:jc w:val="center"/>
+      </w:pPr>
+      <w:r>
+        <w:rPr>
+          <w:rFonts w:ascii="Calibri" w:hAnsi="Calibri"/>
+          <w:i/>
+          <w:color w:val="646464"/>
+          <w:sz w:val="17"/>
+        </w:rPr>
+        <w:t>Figure 3: Intra-Month Nowcasting Convergence with Monotonically Decaying Error Bounds</w:t>
+      </w:r>
+    </w:p>
+    <w:p>
+      <w:pPr>
+        <w:pStyle w:val="Heading1"/>
+        <w:spacing w:before="200" w:after="80"/>
+      </w:pPr>
+      <w:r>
+        <w:t>5. Decision-Support Metabase Dashboards &amp; Monitoring</w:t>
+      </w:r>
+    </w:p>
+    <w:p>
+      <w:r>
+        <w:t>To provide actionable macroeconomic intelligence and continuous pipeline observability, the system implements three dedicated production dashboards in Metabase (running in Docker containers):</w:t>
+      </w:r>
+    </w:p>
+    <w:p>
+      <w:pPr>
+        <w:pStyle w:val="Heading2"/>
+      </w:pPr>
+      <w:r>
+        <w:t>Dashboard 1: Macro CPI &amp; Inflation Analytics</w:t>
+      </w:r>
+    </w:p>
+    <w:p>
+      <w:pPr>
+        <w:spacing w:before="20" w:after="80"/>
+      </w:pPr>
+      <w:r>
+        <w:t>Presents real-time daily Headline CPI and Core CPI (excluding volatile Food &amp; Energy), month-over-month (MoM) and year-over-year (YoY) inflation rates, 12 COICOP division breakdowns, and out-of-sample tracking error against official National Institute of Statistics (NIS) monthly reports.</w:t>
+      </w:r>
+    </w:p>
+    <w:p>
+      <w:pPr>
+        <w:spacing w:before="80" w:after="40"/>
+        <w:jc w:val="center"/>
+      </w:pPr>
+      <w:r>
+        <w:drawing>
+          <wp:inline xmlns:a="http://schemas.openxmlformats.org/drawingml/2006/main" xmlns:pic="http://schemas.openxmlformats.org/drawingml/2006/picture">
+            <wp:extent cx="5303520" cy="2327196"/>
+            <wp:docPr id="4" name="Picture 4"/>
+            <wp:cNvGraphicFramePr>
+              <a:graphicFrameLocks noChangeAspect="1"/>
+            </wp:cNvGraphicFramePr>
+            <a:graphic>
+              <a:graphicData uri="http://schemas.openxmlformats.org/drawingml/2006/picture">
+                <pic:pic>
+                  <pic:nvPicPr>
+                    <pic:cNvPr id="0" name="dashboard_97_macro_cpi.png"/>
+                    <pic:cNvPicPr/>
+                  </pic:nvPicPr>
+                  <pic:blipFill>
+                    <a:blip r:embed="rId14"/>
+                    <a:stretch>
+                      <a:fillRect/>
+                    </a:stretch>
+                  </pic:blipFill>
+                  <pic:spPr>
+                    <a:xfrm>
+                      <a:off x="0" y="0"/>
+                      <a:ext cx="5303520" cy="2327196"/>
+                    </a:xfrm>
+                    <a:prstGeom prst="rect"/>
+                  </pic:spPr>
+                </pic:pic>
+              </a:graphicData>
+            </a:graphic>
+          </wp:inline>
+        </w:drawing>
+      </w:r>
+    </w:p>
+    <w:p>
+      <w:pPr>
+        <w:spacing w:before="20" w:after="120"/>
+        <w:jc w:val="center"/>
+      </w:pPr>
+      <w:r>
+        <w:rPr>
+          <w:rFonts w:ascii="Calibri" w:hAnsi="Calibri"/>
+          <w:i/>
+          <w:color w:val="646464"/>
+          <w:sz w:val="17"/>
+        </w:rPr>
+        <w:t>Figure 4: Metabase Dashboard 1 — Real-Time Macro CPI &amp; Inflation Analytics</w:t>
+      </w:r>
+    </w:p>
+    <w:p>
+      <w:pPr>
+        <w:pStyle w:val="Heading2"/>
+      </w:pPr>
+      <w:r>
+        <w:t>Dashboard 2: Operations &amp; Data Source Telemetry</w:t>
+      </w:r>
+    </w:p>
+    <w:p>
+      <w:pPr>
+        <w:spacing w:before="20" w:after="80"/>
+      </w:pPr>
+      <w:r>
+        <w:t>Monitors daily ingestion health across all 11 retail and service data sources. Displays daily scraped observation counts, scraper execution runtimes, HTTP status codes, browser automation latency, and active catalog availability.</w:t>
+      </w:r>
+    </w:p>
+    <w:p>
+      <w:pPr>
+        <w:spacing w:before="80" w:after="40"/>
+        <w:jc w:val="center"/>
+      </w:pPr>
+      <w:r>
+        <w:drawing>
+          <wp:inline xmlns:a="http://schemas.openxmlformats.org/drawingml/2006/main" xmlns:pic="http://schemas.openxmlformats.org/drawingml/2006/picture">
+            <wp:extent cx="5303520" cy="2327196"/>
+            <wp:docPr id="5" name="Picture 5"/>
+            <wp:cNvGraphicFramePr>
+              <a:graphicFrameLocks noChangeAspect="1"/>
+            </wp:cNvGraphicFramePr>
+            <a:graphic>
+              <a:graphicData uri="http://schemas.openxmlformats.org/drawingml/2006/picture">
+                <pic:pic>
+                  <pic:nvPicPr>
+                    <pic:cNvPr id="0" name="dashboard_98_telemetry.png"/>
+                    <pic:cNvPicPr/>
+                  </pic:nvPicPr>
+                  <pic:blipFill>
+                    <a:blip r:embed="rId15"/>
+                    <a:stretch>
+                      <a:fillRect/>
+                    </a:stretch>
+                  </pic:blipFill>
+                  <pic:spPr>
+                    <a:xfrm>
+                      <a:off x="0" y="0"/>
+                      <a:ext cx="5303520" cy="2327196"/>
+                    </a:xfrm>
+                    <a:prstGeom prst="rect"/>
+                  </pic:spPr>
+                </pic:pic>
+              </a:graphicData>
+            </a:graphic>
+          </wp:inline>
+        </w:drawing>
+      </w:r>
+    </w:p>
+    <w:p>
+      <w:pPr>
+        <w:spacing w:before="20" w:after="120"/>
+        <w:jc w:val="center"/>
+      </w:pPr>
+      <w:r>
+        <w:rPr>
+          <w:rFonts w:ascii="Calibri" w:hAnsi="Calibri"/>
+          <w:i/>
+          <w:color w:val="646464"/>
+          <w:sz w:val="17"/>
+        </w:rPr>
+        <w:t>Figure 5: Metabase Dashboard 2 — Data Lake Operations &amp; Scraping Telemetry</w:t>
+      </w:r>
+    </w:p>
+    <w:p>
+      <w:pPr>
+        <w:pStyle w:val="Heading2"/>
+      </w:pPr>
+      <w:r>
+        <w:t>Dashboard 3: Silver Layer Data Quality Screener</w:t>
+      </w:r>
+    </w:p>
+    <w:p>
+      <w:pPr>
+        <w:spacing w:before="20" w:after="80"/>
+      </w:pPr>
+      <w:r>
+        <w:t>Performs live quality screening across raw-to-silver transformations. Tracks unit normalization rates (conversions to 1kg/1L), dual currency conversion (USD/KHR via daily MEF rates), 5-step entity matching waterfall hit rates (Barcode, SKU, text+size, vector pgvector, fuzzy), and Gemini AI classification guardrails (preventing pet food/cleaning chemical classification errors).</w:t>
+      </w:r>
+    </w:p>
+    <w:p>
+      <w:pPr>
+        <w:spacing w:before="80" w:after="40"/>
+        <w:jc w:val="center"/>
+      </w:pPr>
+      <w:r>
+        <w:drawing>
+          <wp:inline xmlns:a="http://schemas.openxmlformats.org/drawingml/2006/main" xmlns:pic="http://schemas.openxmlformats.org/drawingml/2006/picture">
+            <wp:extent cx="5303520" cy="2327196"/>
+            <wp:docPr id="6" name="Picture 6"/>
+            <wp:cNvGraphicFramePr>
+              <a:graphicFrameLocks noChangeAspect="1"/>
+            </wp:cNvGraphicFramePr>
+            <a:graphic>
+              <a:graphicData uri="http://schemas.openxmlformats.org/drawingml/2006/picture">
+                <pic:pic>
+                  <pic:nvPicPr>
+                    <pic:cNvPr id="0" name="dashboard_99_silver_quality.png"/>
+                    <pic:cNvPicPr/>
+                  </pic:nvPicPr>
+                  <pic:blipFill>
+                    <a:blip r:embed="rId16"/>
+                    <a:stretch>
+                      <a:fillRect/>
+                    </a:stretch>
+                  </pic:blipFill>
+                  <pic:spPr>
+                    <a:xfrm>
+                      <a:off x="0" y="0"/>
+                      <a:ext cx="5303520" cy="2327196"/>
+                    </a:xfrm>
+                    <a:prstGeom prst="rect"/>
+                  </pic:spPr>
+                </pic:pic>
+              </a:graphicData>
+            </a:graphic>
+          </wp:inline>
+        </w:drawing>
+      </w:r>
+    </w:p>
+    <w:p>
+      <w:pPr>
+        <w:spacing w:before="20" w:after="120"/>
+        <w:jc w:val="center"/>
+      </w:pPr>
+      <w:r>
+        <w:rPr>
+          <w:rFonts w:ascii="Calibri" w:hAnsi="Calibri"/>
+          <w:i/>
+          <w:color w:val="646464"/>
+          <w:sz w:val="17"/>
+        </w:rPr>
+        <w:t>Figure 6: Metabase Dashboard 3 — Silver Layer Data Quality &amp; Classification Screener</w:t>
       </w:r>
     </w:p>
     <w:sectPr>

</xml_diff>